<commit_message>
pruebas, mockups y gestion
Co-authored-by: Paula Belman <166656129+suricataa@users.noreply.github.com>
Co-authored-by: Alexander Sepúlveda <134305713+Alexander23S@users.noreply.github.com>
</commit_message>
<xml_diff>
--- a/Fase 2/Evidencias Proyecto/Evidencias de documentación/Diseño/Diccionario de datos.docx
+++ b/Fase 2/Evidencias Proyecto/Evidencias de documentación/Diseño/Diccionario de datos.docx
@@ -225,7 +225,7 @@
           <w:lang w:val="es-ES"/>
         </w:rPr>
       </w:pPr>
-      <w:bookmarkStart w:id="0" w:name="_Toc244085995"/>
+      <w:bookmarkStart w:id="0" w:name="_Toc244090421"/>
       <w:r>
         <w:rPr>
           <w:rFonts w:eastAsia="Times New Roman"/>
@@ -295,7 +295,7 @@
         <w:rPr>
           <w:noProof/>
         </w:rPr>
-        <w:instrText xml:space="preserve"> PAGEREF _Toc244085995 \h </w:instrText>
+        <w:instrText xml:space="preserve"> PAGEREF _Toc244090421 \h </w:instrText>
       </w:r>
       <w:r>
         <w:rPr>
@@ -359,7 +359,7 @@
         <w:rPr>
           <w:noProof/>
         </w:rPr>
-        <w:instrText xml:space="preserve"> PAGEREF _Toc244085996 \h </w:instrText>
+        <w:instrText xml:space="preserve"> PAGEREF _Toc244090422 \h </w:instrText>
       </w:r>
       <w:r>
         <w:rPr>
@@ -423,7 +423,7 @@
         <w:rPr>
           <w:noProof/>
         </w:rPr>
-        <w:instrText xml:space="preserve"> PAGEREF _Toc244085997 \h </w:instrText>
+        <w:instrText xml:space="preserve"> PAGEREF _Toc244090423 \h </w:instrText>
       </w:r>
       <w:r>
         <w:rPr>
@@ -487,7 +487,7 @@
         <w:rPr>
           <w:noProof/>
         </w:rPr>
-        <w:instrText xml:space="preserve"> PAGEREF _Toc244085998 \h </w:instrText>
+        <w:instrText xml:space="preserve"> PAGEREF _Toc244090424 \h </w:instrText>
       </w:r>
       <w:r>
         <w:rPr>
@@ -551,7 +551,7 @@
         <w:rPr>
           <w:noProof/>
         </w:rPr>
-        <w:instrText xml:space="preserve"> PAGEREF _Toc244085999 \h </w:instrText>
+        <w:instrText xml:space="preserve"> PAGEREF _Toc244090425 \h </w:instrText>
       </w:r>
       <w:r>
         <w:rPr>
@@ -615,7 +615,7 @@
         <w:rPr>
           <w:noProof/>
         </w:rPr>
-        <w:instrText xml:space="preserve"> PAGEREF _Toc244086000 \h </w:instrText>
+        <w:instrText xml:space="preserve"> PAGEREF _Toc244090426 \h </w:instrText>
       </w:r>
       <w:r>
         <w:rPr>
@@ -679,7 +679,7 @@
         <w:rPr>
           <w:noProof/>
         </w:rPr>
-        <w:instrText xml:space="preserve"> PAGEREF _Toc244086001 \h </w:instrText>
+        <w:instrText xml:space="preserve"> PAGEREF _Toc244090427 \h </w:instrText>
       </w:r>
       <w:r>
         <w:rPr>
@@ -743,7 +743,7 @@
         <w:rPr>
           <w:noProof/>
         </w:rPr>
-        <w:instrText xml:space="preserve"> PAGEREF _Toc244086002 \h </w:instrText>
+        <w:instrText xml:space="preserve"> PAGEREF _Toc244090428 \h </w:instrText>
       </w:r>
       <w:r>
         <w:rPr>
@@ -807,7 +807,7 @@
         <w:rPr>
           <w:noProof/>
         </w:rPr>
-        <w:instrText xml:space="preserve"> PAGEREF _Toc244086003 \h </w:instrText>
+        <w:instrText xml:space="preserve"> PAGEREF _Toc244090429 \h </w:instrText>
       </w:r>
       <w:r>
         <w:rPr>
@@ -871,7 +871,7 @@
         <w:rPr>
           <w:noProof/>
         </w:rPr>
-        <w:instrText xml:space="preserve"> PAGEREF _Toc244086004 \h </w:instrText>
+        <w:instrText xml:space="preserve"> PAGEREF _Toc244090430 \h </w:instrText>
       </w:r>
       <w:r>
         <w:rPr>
@@ -935,7 +935,7 @@
         <w:rPr>
           <w:noProof/>
         </w:rPr>
-        <w:instrText xml:space="preserve"> PAGEREF _Toc244086005 \h </w:instrText>
+        <w:instrText xml:space="preserve"> PAGEREF _Toc244090431 \h </w:instrText>
       </w:r>
       <w:r>
         <w:rPr>
@@ -999,7 +999,7 @@
         <w:rPr>
           <w:noProof/>
         </w:rPr>
-        <w:instrText xml:space="preserve"> PAGEREF _Toc244086006 \h </w:instrText>
+        <w:instrText xml:space="preserve"> PAGEREF _Toc244090432 \h </w:instrText>
       </w:r>
       <w:r>
         <w:rPr>
@@ -1063,7 +1063,7 @@
         <w:rPr>
           <w:noProof/>
         </w:rPr>
-        <w:instrText xml:space="preserve"> PAGEREF _Toc244086007 \h </w:instrText>
+        <w:instrText xml:space="preserve"> PAGEREF _Toc244090433 \h </w:instrText>
       </w:r>
       <w:r>
         <w:rPr>
@@ -1127,7 +1127,7 @@
         <w:rPr>
           <w:noProof/>
         </w:rPr>
-        <w:instrText xml:space="preserve"> PAGEREF _Toc244086008 \h </w:instrText>
+        <w:instrText xml:space="preserve"> PAGEREF _Toc244090434 \h </w:instrText>
       </w:r>
       <w:r>
         <w:rPr>
@@ -1191,7 +1191,7 @@
         <w:rPr>
           <w:noProof/>
         </w:rPr>
-        <w:instrText xml:space="preserve"> PAGEREF _Toc244086009 \h </w:instrText>
+        <w:instrText xml:space="preserve"> PAGEREF _Toc244090435 \h </w:instrText>
       </w:r>
       <w:r>
         <w:rPr>
@@ -1242,7 +1242,7 @@
           <w:lang w:val="es-ES"/>
         </w:rPr>
       </w:pPr>
-      <w:bookmarkStart w:id="1" w:name="_Toc244085996"/>
+      <w:bookmarkStart w:id="1" w:name="_Toc244090422"/>
       <w:r>
         <w:rPr>
           <w:rFonts w:eastAsia="Times New Roman"/>
@@ -1304,6 +1304,7 @@
     <w:p>
       <w:pPr>
         <w:pStyle w:val="NormalWeb"/>
+        <w:keepNext/>
         <w:rPr>
           <w:szCs w:val="22"/>
           <w:lang w:val="es-ES"/>
@@ -1342,10 +1343,10 @@
           <w:lang w:val="es-ES"/>
         </w:rPr>
         <w:drawing>
-          <wp:inline distT="0" distB="0" distL="0" distR="0" wp14:anchorId="3339C982" wp14:editId="3F6AC81C">
+          <wp:inline distT="0" distB="0" distL="0" distR="0" wp14:anchorId="5118B762" wp14:editId="0B6E32E5">
             <wp:extent cx="5905500" cy="3016162"/>
             <wp:effectExtent l="0" t="0" r="0" b="0"/>
-            <wp:docPr id="2144434743" name="Imagen 1"/>
+            <wp:docPr id="710251275" name="Imagen 1"/>
             <wp:cNvGraphicFramePr>
               <a:graphicFrameLocks xmlns:a="http://schemas.openxmlformats.org/drawingml/2006/main" noChangeAspect="1"/>
             </wp:cNvGraphicFramePr>
@@ -1353,7 +1354,7 @@
               <a:graphicData uri="http://schemas.openxmlformats.org/drawingml/2006/picture">
                 <pic:pic xmlns:pic="http://schemas.openxmlformats.org/drawingml/2006/picture">
                   <pic:nvPicPr>
-                    <pic:cNvPr id="2144434743" name=""/>
+                    <pic:cNvPr id="710251275" name=""/>
                     <pic:cNvPicPr/>
                   </pic:nvPicPr>
                   <pic:blipFill>
@@ -1415,7 +1416,7 @@
           <w:lang w:val="es-ES"/>
         </w:rPr>
       </w:pPr>
-      <w:bookmarkStart w:id="2" w:name="_Toc244085997"/>
+      <w:bookmarkStart w:id="2" w:name="_Toc244090423"/>
       <w:r>
         <w:rPr>
           <w:rFonts w:eastAsia="Times New Roman"/>
@@ -1434,7 +1435,7 @@
           <w:lang w:val="es-ES"/>
         </w:rPr>
       </w:pPr>
-      <w:bookmarkStart w:id="3" w:name="_Toc244085998"/>
+      <w:bookmarkStart w:id="3" w:name="_Toc244090424"/>
       <w:r>
         <w:rPr>
           <w:rFonts w:eastAsia="Times New Roman"/>
@@ -4159,7 +4160,7 @@
           <w:lang w:val="es-ES"/>
         </w:rPr>
       </w:pPr>
-      <w:bookmarkStart w:id="4" w:name="_Toc244085999"/>
+      <w:bookmarkStart w:id="4" w:name="_Toc244090425"/>
       <w:r>
         <w:rPr>
           <w:rFonts w:eastAsia="Times New Roman"/>
@@ -4189,7 +4190,6 @@
     <w:tbl>
       <w:tblPr>
         <w:tblW w:w="9406" w:type="dxa"/>
-        <w:tblInd w:w="-8" w:type="dxa"/>
         <w:tblLayout w:type="fixed"/>
         <w:tblCellMar>
           <w:top w:w="15" w:type="dxa"/>
@@ -6174,7 +6174,7 @@
           <w:lang w:val="es-ES"/>
         </w:rPr>
       </w:pPr>
-      <w:bookmarkStart w:id="5" w:name="_Toc244086000"/>
+      <w:bookmarkStart w:id="5" w:name="_Toc244090426"/>
       <w:r>
         <w:rPr>
           <w:rFonts w:eastAsia="Times New Roman"/>
@@ -6203,7 +6203,6 @@
     <w:tbl>
       <w:tblPr>
         <w:tblW w:w="9408" w:type="dxa"/>
-        <w:tblInd w:w="-8" w:type="dxa"/>
         <w:tblLayout w:type="fixed"/>
         <w:tblCellMar>
           <w:top w:w="15" w:type="dxa"/>
@@ -7530,7 +7529,7 @@
           <w:lang w:val="es-ES"/>
         </w:rPr>
       </w:pPr>
-      <w:bookmarkStart w:id="6" w:name="_Toc244086001"/>
+      <w:bookmarkStart w:id="6" w:name="_Toc244090427"/>
       <w:r>
         <w:rPr>
           <w:rFonts w:eastAsia="Times New Roman"/>
@@ -7559,7 +7558,6 @@
     <w:tbl>
       <w:tblPr>
         <w:tblW w:w="9406" w:type="dxa"/>
-        <w:tblInd w:w="-8" w:type="dxa"/>
         <w:tblLayout w:type="fixed"/>
         <w:tblCellMar>
           <w:top w:w="15" w:type="dxa"/>
@@ -8895,7 +8893,7 @@
           <w:lang w:val="es-ES"/>
         </w:rPr>
       </w:pPr>
-      <w:bookmarkStart w:id="7" w:name="_Toc244086002"/>
+      <w:bookmarkStart w:id="7" w:name="_Toc244090428"/>
       <w:r>
         <w:rPr>
           <w:rFonts w:eastAsia="Times New Roman"/>
@@ -8924,7 +8922,6 @@
     <w:tbl>
       <w:tblPr>
         <w:tblW w:w="9404" w:type="dxa"/>
-        <w:tblInd w:w="-8" w:type="dxa"/>
         <w:tblLayout w:type="fixed"/>
         <w:tblCellMar>
           <w:top w:w="15" w:type="dxa"/>
@@ -9706,7 +9703,7 @@
           <w:lang w:val="es-ES"/>
         </w:rPr>
       </w:pPr>
-      <w:bookmarkStart w:id="8" w:name="_Toc244086003"/>
+      <w:bookmarkStart w:id="8" w:name="_Toc244090429"/>
       <w:r>
         <w:rPr>
           <w:rFonts w:eastAsia="Times New Roman"/>
@@ -9735,7 +9732,6 @@
     <w:tbl>
       <w:tblPr>
         <w:tblW w:w="9406" w:type="dxa"/>
-        <w:tblInd w:w="-8" w:type="dxa"/>
         <w:tblLayout w:type="fixed"/>
         <w:tblCellMar>
           <w:top w:w="15" w:type="dxa"/>
@@ -11927,7 +11923,7 @@
           <w:lang w:val="es-ES"/>
         </w:rPr>
       </w:pPr>
-      <w:bookmarkStart w:id="9" w:name="_Toc244086004"/>
+      <w:bookmarkStart w:id="9" w:name="_Toc244090430"/>
       <w:r>
         <w:rPr>
           <w:rFonts w:eastAsia="Times New Roman"/>
@@ -11956,7 +11952,6 @@
     <w:tbl>
       <w:tblPr>
         <w:tblW w:w="9407" w:type="dxa"/>
-        <w:tblInd w:w="-8" w:type="dxa"/>
         <w:tblLayout w:type="fixed"/>
         <w:tblCellMar>
           <w:top w:w="15" w:type="dxa"/>
@@ -13462,7 +13457,7 @@
           <w:lang w:val="es-ES"/>
         </w:rPr>
       </w:pPr>
-      <w:bookmarkStart w:id="10" w:name="_Toc244086005"/>
+      <w:bookmarkStart w:id="10" w:name="_Toc244090431"/>
       <w:r>
         <w:rPr>
           <w:rFonts w:eastAsia="Times New Roman"/>
@@ -13491,7 +13486,6 @@
     <w:tbl>
       <w:tblPr>
         <w:tblW w:w="9407" w:type="dxa"/>
-        <w:tblInd w:w="-8" w:type="dxa"/>
         <w:tblLayout w:type="fixed"/>
         <w:tblCellMar>
           <w:top w:w="15" w:type="dxa"/>
@@ -14827,7 +14821,7 @@
           <w:lang w:val="es-ES"/>
         </w:rPr>
       </w:pPr>
-      <w:bookmarkStart w:id="11" w:name="_Toc244086006"/>
+      <w:bookmarkStart w:id="11" w:name="_Toc244090432"/>
       <w:r>
         <w:rPr>
           <w:rFonts w:eastAsia="Times New Roman"/>
@@ -14856,7 +14850,6 @@
     <w:tbl>
       <w:tblPr>
         <w:tblW w:w="9406" w:type="dxa"/>
-        <w:tblInd w:w="-8" w:type="dxa"/>
         <w:tblLayout w:type="fixed"/>
         <w:tblCellMar>
           <w:top w:w="15" w:type="dxa"/>
@@ -16691,7 +16684,7 @@
           <w:lang w:val="es-ES"/>
         </w:rPr>
       </w:pPr>
-      <w:bookmarkStart w:id="12" w:name="_Toc244086007"/>
+      <w:bookmarkStart w:id="12" w:name="_Toc244090433"/>
       <w:r>
         <w:rPr>
           <w:rFonts w:eastAsia="Times New Roman"/>
@@ -16721,7 +16714,6 @@
     <w:tbl>
       <w:tblPr>
         <w:tblW w:w="9405" w:type="dxa"/>
-        <w:tblInd w:w="-8" w:type="dxa"/>
         <w:tblLayout w:type="fixed"/>
         <w:tblCellMar>
           <w:top w:w="15" w:type="dxa"/>
@@ -18714,7 +18706,7 @@
           <w:lang w:val="es-ES"/>
         </w:rPr>
       </w:pPr>
-      <w:bookmarkStart w:id="13" w:name="_Toc244086008"/>
+      <w:bookmarkStart w:id="13" w:name="_Toc244090434"/>
       <w:r>
         <w:rPr>
           <w:rFonts w:eastAsia="Times New Roman"/>
@@ -18728,7 +18720,6 @@
     <w:tbl>
       <w:tblPr>
         <w:tblW w:w="9406" w:type="dxa"/>
-        <w:tblInd w:w="-8" w:type="dxa"/>
         <w:tblLayout w:type="fixed"/>
         <w:tblCellMar>
           <w:top w:w="15" w:type="dxa"/>
@@ -19981,7 +19972,7 @@
           <w:lang w:val="es-ES"/>
         </w:rPr>
       </w:pPr>
-      <w:bookmarkStart w:id="14" w:name="_Toc244086009"/>
+      <w:bookmarkStart w:id="14" w:name="_Toc244090435"/>
       <w:r>
         <w:rPr>
           <w:rFonts w:eastAsia="Times New Roman"/>
@@ -19995,7 +19986,6 @@
     <w:tbl>
       <w:tblPr>
         <w:tblW w:w="9406" w:type="dxa"/>
-        <w:tblInd w:w="-8" w:type="dxa"/>
         <w:tblLayout w:type="fixed"/>
         <w:tblCellMar>
           <w:top w:w="15" w:type="dxa"/>
@@ -20340,12 +20330,8 @@
       </w:r>
     </w:p>
     <w:sectPr>
-      <w:headerReference w:type="even" r:id="rId7"/>
-      <w:headerReference w:type="default" r:id="rId8"/>
-      <w:footerReference w:type="even" r:id="rId9"/>
-      <w:footerReference w:type="default" r:id="rId10"/>
-      <w:headerReference w:type="first" r:id="rId11"/>
-      <w:footerReference w:type="first" r:id="rId12"/>
+      <w:footerReference w:type="even" r:id="rId7"/>
+      <w:footerReference w:type="default" r:id="rId8"/>
       <w:pgSz w:w="12240" w:h="15840"/>
       <w:pgMar w:top="1417" w:right="1417" w:bottom="1417" w:left="1417" w:header="708" w:footer="708" w:gutter="0"/>
       <w:cols w:space="708"/>
@@ -20483,16 +20469,6 @@
 </w:ftr>
 </file>
 
-<file path=word/footer3.xml><?xml version="1.0" encoding="utf-8"?>
-<w:ftr xmlns:wpc="http://schemas.microsoft.com/office/word/2010/wordprocessingCanvas" xmlns:cx="http://schemas.microsoft.com/office/drawing/2014/chartex" xmlns:cx1="http://schemas.microsoft.com/office/drawing/2015/9/8/chartex" xmlns:cx2="http://schemas.microsoft.com/office/drawing/2015/10/21/chartex" xmlns:cx3="http://schemas.microsoft.com/office/drawing/2016/5/9/chartex" xmlns:cx4="http://schemas.microsoft.com/office/drawing/2016/5/10/chartex" xmlns:cx5="http://schemas.microsoft.com/office/drawing/2016/5/11/chartex" xmlns:cx6="http://schemas.microsoft.com/office/drawing/2016/5/12/chartex" xmlns:cx7="http://schemas.microsoft.com/office/drawing/2016/5/13/chartex" xmlns:cx8="http://schemas.microsoft.com/office/drawing/2016/5/14/chartex" xmlns:mc="http://schemas.openxmlformats.org/markup-compatibility/2006" xmlns:aink="http://schemas.microsoft.com/office/drawing/2016/ink" xmlns:am3d="http://schemas.microsoft.com/office/drawing/2017/model3d" xmlns:o="urn:schemas-microsoft-com:office:office" xmlns:oel="http://schemas.microsoft.com/office/2019/extlst" xmlns:r="http://schemas.openxmlformats.org/officeDocument/2006/relationships" xmlns:m="http://schemas.openxmlformats.org/officeDocument/2006/math" xmlns:v="urn:schemas-microsoft-com:vml" xmlns:wp14="http://schemas.microsoft.com/office/word/2010/wordprocessingDrawing" xmlns:wp="http://schemas.openxmlformats.org/drawingml/2006/wordprocessingDrawing" xmlns:w10="urn:schemas-microsoft-com:office:word" xmlns:w="http://schemas.openxmlformats.org/wordprocessingml/2006/main" xmlns:w14="http://schemas.microsoft.com/office/word/2010/wordml" xmlns:w15="http://schemas.microsoft.com/office/word/2012/wordml" xmlns:w16cex="http://schemas.microsoft.com/office/word/2018/wordml/cex" xmlns:w16cid="http://schemas.microsoft.com/office/word/2016/wordml/cid" xmlns:w16="http://schemas.microsoft.com/office/word/2018/wordml" xmlns:w16du="http://schemas.microsoft.com/office/word/2023/wordml/word16du" xmlns:w16sdtdh="http://schemas.microsoft.com/office/word/2020/wordml/sdtdatahash" xmlns:w16sdtfl="http://schemas.microsoft.com/office/word/2024/wordml/sdtformatlock" xmlns:w16se="http://schemas.microsoft.com/office/word/2015/wordml/symex" xmlns:wpg="http://schemas.microsoft.com/office/word/2010/wordprocessingGroup" xmlns:wpi="http://schemas.microsoft.com/office/word/2010/wordprocessingInk" xmlns:wne="http://schemas.microsoft.com/office/word/2006/wordml" xmlns:wps="http://schemas.microsoft.com/office/word/2010/wordprocessingShape" mc:Ignorable="w14 w15 w16se w16cid w16 w16cex w16sdtdh w16sdtfl w16du wp14">
-  <w:p>
-    <w:pPr>
-      <w:pStyle w:val="Piedepgina"/>
-    </w:pPr>
-  </w:p>
-</w:ftr>
-</file>
-
 <file path=word/footnotes.xml><?xml version="1.0" encoding="utf-8"?>
 <w:footnotes xmlns:wpc="http://schemas.microsoft.com/office/word/2010/wordprocessingCanvas" xmlns:cx="http://schemas.microsoft.com/office/drawing/2014/chartex" xmlns:cx1="http://schemas.microsoft.com/office/drawing/2015/9/8/chartex" xmlns:cx2="http://schemas.microsoft.com/office/drawing/2015/10/21/chartex" xmlns:cx3="http://schemas.microsoft.com/office/drawing/2016/5/9/chartex" xmlns:cx4="http://schemas.microsoft.com/office/drawing/2016/5/10/chartex" xmlns:cx5="http://schemas.microsoft.com/office/drawing/2016/5/11/chartex" xmlns:cx6="http://schemas.microsoft.com/office/drawing/2016/5/12/chartex" xmlns:cx7="http://schemas.microsoft.com/office/drawing/2016/5/13/chartex" xmlns:cx8="http://schemas.microsoft.com/office/drawing/2016/5/14/chartex" xmlns:mc="http://schemas.openxmlformats.org/markup-compatibility/2006" xmlns:aink="http://schemas.microsoft.com/office/drawing/2016/ink" xmlns:am3d="http://schemas.microsoft.com/office/drawing/2017/model3d" xmlns:o="urn:schemas-microsoft-com:office:office" xmlns:oel="http://schemas.microsoft.com/office/2019/extlst" xmlns:r="http://schemas.openxmlformats.org/officeDocument/2006/relationships" xmlns:m="http://schemas.openxmlformats.org/officeDocument/2006/math" xmlns:v="urn:schemas-microsoft-com:vml" xmlns:wp14="http://schemas.microsoft.com/office/word/2010/wordprocessingDrawing" xmlns:wp="http://schemas.openxmlformats.org/drawingml/2006/wordprocessingDrawing" xmlns:w10="urn:schemas-microsoft-com:office:word" xmlns:w="http://schemas.openxmlformats.org/wordprocessingml/2006/main" xmlns:w14="http://schemas.microsoft.com/office/word/2010/wordml" xmlns:w15="http://schemas.microsoft.com/office/word/2012/wordml" xmlns:w16cex="http://schemas.microsoft.com/office/word/2018/wordml/cex" xmlns:w16cid="http://schemas.microsoft.com/office/word/2016/wordml/cid" xmlns:w16="http://schemas.microsoft.com/office/word/2018/wordml" xmlns:w16du="http://schemas.microsoft.com/office/word/2023/wordml/word16du" xmlns:w16sdtdh="http://schemas.microsoft.com/office/word/2020/wordml/sdtdatahash" xmlns:w16sdtfl="http://schemas.microsoft.com/office/word/2024/wordml/sdtformatlock" xmlns:w16se="http://schemas.microsoft.com/office/word/2015/wordml/symex" xmlns:wpg="http://schemas.microsoft.com/office/word/2010/wordprocessingGroup" xmlns:wpi="http://schemas.microsoft.com/office/word/2010/wordprocessingInk" xmlns:wne="http://schemas.microsoft.com/office/word/2006/wordml" xmlns:wps="http://schemas.microsoft.com/office/word/2010/wordprocessingShape" mc:Ignorable="w14 w15 w16se w16cid w16 w16cex w16sdtdh w16sdtfl w16du wp14">
   <w:footnote w:type="separator" w:id="-1">
@@ -20516,36 +20492,6 @@
     </w:p>
   </w:footnote>
 </w:footnotes>
-</file>
-
-<file path=word/header1.xml><?xml version="1.0" encoding="utf-8"?>
-<w:hdr xmlns:wpc="http://schemas.microsoft.com/office/word/2010/wordprocessingCanvas" xmlns:cx="http://schemas.microsoft.com/office/drawing/2014/chartex" xmlns:cx1="http://schemas.microsoft.com/office/drawing/2015/9/8/chartex" xmlns:cx2="http://schemas.microsoft.com/office/drawing/2015/10/21/chartex" xmlns:cx3="http://schemas.microsoft.com/office/drawing/2016/5/9/chartex" xmlns:cx4="http://schemas.microsoft.com/office/drawing/2016/5/10/chartex" xmlns:cx5="http://schemas.microsoft.com/office/drawing/2016/5/11/chartex" xmlns:cx6="http://schemas.microsoft.com/office/drawing/2016/5/12/chartex" xmlns:cx7="http://schemas.microsoft.com/office/drawing/2016/5/13/chartex" xmlns:cx8="http://schemas.microsoft.com/office/drawing/2016/5/14/chartex" xmlns:mc="http://schemas.openxmlformats.org/markup-compatibility/2006" xmlns:aink="http://schemas.microsoft.com/office/drawing/2016/ink" xmlns:am3d="http://schemas.microsoft.com/office/drawing/2017/model3d" xmlns:o="urn:schemas-microsoft-com:office:office" xmlns:oel="http://schemas.microsoft.com/office/2019/extlst" xmlns:r="http://schemas.openxmlformats.org/officeDocument/2006/relationships" xmlns:m="http://schemas.openxmlformats.org/officeDocument/2006/math" xmlns:v="urn:schemas-microsoft-com:vml" xmlns:wp14="http://schemas.microsoft.com/office/word/2010/wordprocessingDrawing" xmlns:wp="http://schemas.openxmlformats.org/drawingml/2006/wordprocessingDrawing" xmlns:w10="urn:schemas-microsoft-com:office:word" xmlns:w="http://schemas.openxmlformats.org/wordprocessingml/2006/main" xmlns:w14="http://schemas.microsoft.com/office/word/2010/wordml" xmlns:w15="http://schemas.microsoft.com/office/word/2012/wordml" xmlns:w16cex="http://schemas.microsoft.com/office/word/2018/wordml/cex" xmlns:w16cid="http://schemas.microsoft.com/office/word/2016/wordml/cid" xmlns:w16="http://schemas.microsoft.com/office/word/2018/wordml" xmlns:w16du="http://schemas.microsoft.com/office/word/2023/wordml/word16du" xmlns:w16sdtdh="http://schemas.microsoft.com/office/word/2020/wordml/sdtdatahash" xmlns:w16sdtfl="http://schemas.microsoft.com/office/word/2024/wordml/sdtformatlock" xmlns:w16se="http://schemas.microsoft.com/office/word/2015/wordml/symex" xmlns:wpg="http://schemas.microsoft.com/office/word/2010/wordprocessingGroup" xmlns:wpi="http://schemas.microsoft.com/office/word/2010/wordprocessingInk" xmlns:wne="http://schemas.microsoft.com/office/word/2006/wordml" xmlns:wps="http://schemas.microsoft.com/office/word/2010/wordprocessingShape" mc:Ignorable="w14 w15 w16se w16cid w16 w16cex w16sdtdh w16sdtfl w16du wp14">
-  <w:p>
-    <w:pPr>
-      <w:pStyle w:val="Encabezado"/>
-    </w:pPr>
-  </w:p>
-</w:hdr>
-</file>
-
-<file path=word/header2.xml><?xml version="1.0" encoding="utf-8"?>
-<w:hdr xmlns:wpc="http://schemas.microsoft.com/office/word/2010/wordprocessingCanvas" xmlns:cx="http://schemas.microsoft.com/office/drawing/2014/chartex" xmlns:cx1="http://schemas.microsoft.com/office/drawing/2015/9/8/chartex" xmlns:cx2="http://schemas.microsoft.com/office/drawing/2015/10/21/chartex" xmlns:cx3="http://schemas.microsoft.com/office/drawing/2016/5/9/chartex" xmlns:cx4="http://schemas.microsoft.com/office/drawing/2016/5/10/chartex" xmlns:cx5="http://schemas.microsoft.com/office/drawing/2016/5/11/chartex" xmlns:cx6="http://schemas.microsoft.com/office/drawing/2016/5/12/chartex" xmlns:cx7="http://schemas.microsoft.com/office/drawing/2016/5/13/chartex" xmlns:cx8="http://schemas.microsoft.com/office/drawing/2016/5/14/chartex" xmlns:mc="http://schemas.openxmlformats.org/markup-compatibility/2006" xmlns:aink="http://schemas.microsoft.com/office/drawing/2016/ink" xmlns:am3d="http://schemas.microsoft.com/office/drawing/2017/model3d" xmlns:o="urn:schemas-microsoft-com:office:office" xmlns:oel="http://schemas.microsoft.com/office/2019/extlst" xmlns:r="http://schemas.openxmlformats.org/officeDocument/2006/relationships" xmlns:m="http://schemas.openxmlformats.org/officeDocument/2006/math" xmlns:v="urn:schemas-microsoft-com:vml" xmlns:wp14="http://schemas.microsoft.com/office/word/2010/wordprocessingDrawing" xmlns:wp="http://schemas.openxmlformats.org/drawingml/2006/wordprocessingDrawing" xmlns:w10="urn:schemas-microsoft-com:office:word" xmlns:w="http://schemas.openxmlformats.org/wordprocessingml/2006/main" xmlns:w14="http://schemas.microsoft.com/office/word/2010/wordml" xmlns:w15="http://schemas.microsoft.com/office/word/2012/wordml" xmlns:w16cex="http://schemas.microsoft.com/office/word/2018/wordml/cex" xmlns:w16cid="http://schemas.microsoft.com/office/word/2016/wordml/cid" xmlns:w16="http://schemas.microsoft.com/office/word/2018/wordml" xmlns:w16du="http://schemas.microsoft.com/office/word/2023/wordml/word16du" xmlns:w16sdtdh="http://schemas.microsoft.com/office/word/2020/wordml/sdtdatahash" xmlns:w16sdtfl="http://schemas.microsoft.com/office/word/2024/wordml/sdtformatlock" xmlns:w16se="http://schemas.microsoft.com/office/word/2015/wordml/symex" xmlns:wpg="http://schemas.microsoft.com/office/word/2010/wordprocessingGroup" xmlns:wpi="http://schemas.microsoft.com/office/word/2010/wordprocessingInk" xmlns:wne="http://schemas.microsoft.com/office/word/2006/wordml" xmlns:wps="http://schemas.microsoft.com/office/word/2010/wordprocessingShape" mc:Ignorable="w14 w15 w16se w16cid w16 w16cex w16sdtdh w16sdtfl w16du wp14">
-  <w:p>
-    <w:pPr>
-      <w:pStyle w:val="Encabezado"/>
-    </w:pPr>
-  </w:p>
-</w:hdr>
-</file>
-
-<file path=word/header3.xml><?xml version="1.0" encoding="utf-8"?>
-<w:hdr xmlns:wpc="http://schemas.microsoft.com/office/word/2010/wordprocessingCanvas" xmlns:cx="http://schemas.microsoft.com/office/drawing/2014/chartex" xmlns:cx1="http://schemas.microsoft.com/office/drawing/2015/9/8/chartex" xmlns:cx2="http://schemas.microsoft.com/office/drawing/2015/10/21/chartex" xmlns:cx3="http://schemas.microsoft.com/office/drawing/2016/5/9/chartex" xmlns:cx4="http://schemas.microsoft.com/office/drawing/2016/5/10/chartex" xmlns:cx5="http://schemas.microsoft.com/office/drawing/2016/5/11/chartex" xmlns:cx6="http://schemas.microsoft.com/office/drawing/2016/5/12/chartex" xmlns:cx7="http://schemas.microsoft.com/office/drawing/2016/5/13/chartex" xmlns:cx8="http://schemas.microsoft.com/office/drawing/2016/5/14/chartex" xmlns:mc="http://schemas.openxmlformats.org/markup-compatibility/2006" xmlns:aink="http://schemas.microsoft.com/office/drawing/2016/ink" xmlns:am3d="http://schemas.microsoft.com/office/drawing/2017/model3d" xmlns:o="urn:schemas-microsoft-com:office:office" xmlns:oel="http://schemas.microsoft.com/office/2019/extlst" xmlns:r="http://schemas.openxmlformats.org/officeDocument/2006/relationships" xmlns:m="http://schemas.openxmlformats.org/officeDocument/2006/math" xmlns:v="urn:schemas-microsoft-com:vml" xmlns:wp14="http://schemas.microsoft.com/office/word/2010/wordprocessingDrawing" xmlns:wp="http://schemas.openxmlformats.org/drawingml/2006/wordprocessingDrawing" xmlns:w10="urn:schemas-microsoft-com:office:word" xmlns:w="http://schemas.openxmlformats.org/wordprocessingml/2006/main" xmlns:w14="http://schemas.microsoft.com/office/word/2010/wordml" xmlns:w15="http://schemas.microsoft.com/office/word/2012/wordml" xmlns:w16cex="http://schemas.microsoft.com/office/word/2018/wordml/cex" xmlns:w16cid="http://schemas.microsoft.com/office/word/2016/wordml/cid" xmlns:w16="http://schemas.microsoft.com/office/word/2018/wordml" xmlns:w16du="http://schemas.microsoft.com/office/word/2023/wordml/word16du" xmlns:w16sdtdh="http://schemas.microsoft.com/office/word/2020/wordml/sdtdatahash" xmlns:w16sdtfl="http://schemas.microsoft.com/office/word/2024/wordml/sdtformatlock" xmlns:w16se="http://schemas.microsoft.com/office/word/2015/wordml/symex" xmlns:wpg="http://schemas.microsoft.com/office/word/2010/wordprocessingGroup" xmlns:wpi="http://schemas.microsoft.com/office/word/2010/wordprocessingInk" xmlns:wne="http://schemas.microsoft.com/office/word/2006/wordml" xmlns:wps="http://schemas.microsoft.com/office/word/2010/wordprocessingShape" mc:Ignorable="w14 w15 w16se w16cid w16 w16cex w16sdtdh w16sdtfl w16du wp14">
-  <w:p>
-    <w:pPr>
-      <w:pStyle w:val="Encabezado"/>
-    </w:pPr>
-  </w:p>
-</w:hdr>
 </file>
 
 <file path=word/styles.xml><?xml version="1.0" encoding="utf-8"?>
@@ -20998,7 +20944,7 @@
     <w:semiHidden/>
     <w:unhideWhenUsed/>
     <w:qFormat/>
-    <w:rsid w:val="00D248AC"/>
+    <w:rsid w:val="00963594"/>
     <w:pPr>
       <w:keepNext/>
       <w:keepLines/>
@@ -21103,7 +21049,7 @@
     <w:link w:val="Ttulo3"/>
     <w:uiPriority w:val="9"/>
     <w:semiHidden/>
-    <w:rsid w:val="00D248AC"/>
+    <w:rsid w:val="00963594"/>
     <w:rPr>
       <w:rFonts w:ascii="Arial" w:eastAsiaTheme="majorEastAsia" w:hAnsi="Arial" w:cs="Arial"/>
       <w:b/>
@@ -21119,7 +21065,7 @@
     <w:autoRedefine/>
     <w:uiPriority w:val="39"/>
     <w:unhideWhenUsed/>
-    <w:rsid w:val="00D248AC"/>
+    <w:rsid w:val="00963594"/>
     <w:pPr>
       <w:spacing w:after="100"/>
     </w:pPr>
@@ -21131,7 +21077,7 @@
     <w:autoRedefine/>
     <w:uiPriority w:val="39"/>
     <w:unhideWhenUsed/>
-    <w:rsid w:val="00D248AC"/>
+    <w:rsid w:val="00963594"/>
     <w:pPr>
       <w:spacing w:after="100"/>
       <w:ind w:left="220"/>
@@ -21143,7 +21089,7 @@
     <w:link w:val="EncabezadoCar"/>
     <w:uiPriority w:val="99"/>
     <w:unhideWhenUsed/>
-    <w:rsid w:val="00D248AC"/>
+    <w:rsid w:val="00963594"/>
     <w:pPr>
       <w:tabs>
         <w:tab w:val="center" w:pos="4419"/>
@@ -21157,7 +21103,7 @@
     <w:basedOn w:val="Fuentedeprrafopredeter"/>
     <w:link w:val="Encabezado"/>
     <w:uiPriority w:val="99"/>
-    <w:rsid w:val="00D248AC"/>
+    <w:rsid w:val="00963594"/>
     <w:rPr>
       <w:rFonts w:ascii="Arial" w:eastAsiaTheme="minorEastAsia" w:hAnsi="Arial" w:cs="Arial"/>
       <w:sz w:val="22"/>
@@ -21170,7 +21116,7 @@
     <w:link w:val="PiedepginaCar"/>
     <w:uiPriority w:val="99"/>
     <w:unhideWhenUsed/>
-    <w:rsid w:val="00D248AC"/>
+    <w:rsid w:val="00963594"/>
     <w:pPr>
       <w:tabs>
         <w:tab w:val="center" w:pos="4419"/>
@@ -21184,7 +21130,7 @@
     <w:basedOn w:val="Fuentedeprrafopredeter"/>
     <w:link w:val="Piedepgina"/>
     <w:uiPriority w:val="99"/>
-    <w:rsid w:val="00D248AC"/>
+    <w:rsid w:val="00963594"/>
     <w:rPr>
       <w:rFonts w:ascii="Arial" w:eastAsiaTheme="minorEastAsia" w:hAnsi="Arial" w:cs="Arial"/>
       <w:sz w:val="22"/>
@@ -21197,7 +21143,7 @@
     <w:uiPriority w:val="99"/>
     <w:semiHidden/>
     <w:unhideWhenUsed/>
-    <w:rsid w:val="00D248AC"/>
+    <w:rsid w:val="00963594"/>
   </w:style>
 </w:styles>
 </file>

</xml_diff>